<commit_message>
Paper: prior-art search, related work and citations updated; camera-ready sample with author block
Co-Authored-By: Claude Opus 5.5 <noreply@anthropic.com>
</commit_message>
<xml_diff>
--- a/Paper/SRMC_Research_Paper.docx
+++ b/Paper/SRMC_Research_Paper.docx
@@ -122,7 +122,7 @@
         <w:pStyle w:val="BodyTextIndent"/>
       </w:pPr>
       <w:r>
-        <w:t>Panels that tilt can move this compromise hour by hour. Dynamic panels that change how sunlight is shared between solar cells and crops have been demonstrated [6], and crop-specific metrics of light sharing have been proposed for bifacial agrovoltaic arrays [7]. DIN SPEC 91434 lists light availability and homogeneity under the array among its planning requirements [8]. What is less clear is how accurately a practical controller, which sees the field only through a few low-cost sensors, can find the angle that serves both goals, and which of those sensors actually matter.</w:t>
+        <w:t>Panels that tilt can move this compromise hour by hour. Controllers that steer movable panels for the crop have been proposed [6], [7], dynamic panels that change how sunlight is shared between solar cells and crops have been demonstrated [8], and crop-specific metrics of light sharing have been proposed [9]. DIN SPEC 91434 lists light availability and homogeneity under the array among its planning requirements [10]. What is less clear is how accurately a practical controller, which sees the field only through a few low-cost sensors, can find the angle that serves both goals, and which of those sensors actually matter.</w:t>
       </w:r>
     </w:p>
     <w:p>
@@ -146,7 +146,7 @@
         <w:pStyle w:val="BulletList"/>
       </w:pPr>
       <w:r>
-        <w:t>a six-sensor tilt controller that scores both goals in one objective, corrects its crop light model with a light sensor under the panels, lowers the crop light requirement under heat and drought stress, and has a safety layer for sensor faults and panel movement;</w:t>
+        <w:t>a six-sensor tilt controller that scores both goals in one objective, corrects its crop light model online from the ratio of under-panel light to sky light, lowers the crop light requirement under heat and drought stress, and has a safety layer for sensor faults and panel movement;</w:t>
       </w:r>
     </w:p>
     <w:p>
@@ -162,7 +162,7 @@
         <w:pStyle w:val="BulletList"/>
       </w:pPr>
       <w:r>
-        <w:t>a low-cost implementation in which one motor and one drive wire tilt every row of a wire-rope canopy, and an assessment of what the accuracy is worth in yield, income, and water.</w:t>
+        <w:t>a low-cost implementation on a wire-rope canopy, in which one motor and one drive wire tilt every row through lever arms, and an assessment of what the accuracy is worth in yield, income, and water.</w:t>
       </w:r>
     </w:p>
     <w:p>
@@ -178,7 +178,29 @@
         <w:pStyle w:val="BodyTextIndent"/>
       </w:pPr>
       <w:r>
-        <w:t>Agrophotovoltaic systems have been reviewed in terms of applications, challenges, and opportunities [3]. A demonstration plant in Germany reported land-equivalent-ratio gains of 56 to 70 percent in 2017 and close to 90 percent in the hot, dry summer of 2018, with a vertical clearance of 5 m for farm machinery [4]. A modelling study predicted land-productivity gains of 35 to 73 percent, which its authors called preliminary [1], and a field study in drylands reported benefits across food, energy, and water [2]. Lettuce under panel shade kept its yield by intercepting light more efficiently [5]. A dynamic semitransparent panel has been used to allocate sunlight between solar cells and crops [6], and the light productivity factor has been proposed to rank array designs for particular crops [7]. Most of this work concerns layout, crop response, or the panel itself. We concentrate on the control loop: how a tilt controller fed by sensors should decide, and how close it gets to the best possible decision. We have not carried out a formal prior-art search, so we claim no more novelty than the combination described here.</w:t>
+        <w:t>Agrophotovoltaic systems have been reviewed in terms of applications, challenges, and opportunities [3]. A demonstration plant in Germany reported land-equivalent-ratio gains of 56 to 70 percent in 2017 and close to 90 percent in the hot, dry summer of 2018, with a vertical clearance of 5 m for farm machinery [4]. A modelling study predicted land-productivity gains of 35 to 73 percent, which its authors called preliminary [1], and a field study in drylands reported benefits across food, energy, and water [2]. Lettuce under panel shade kept its yield by intercepting light more efficiently [5].</w:t>
+      </w:r>
+    </w:p>
+    <w:p>
+      <w:pPr>
+        <w:pStyle w:val="BodyTextIndent"/>
+      </w:pPr>
+      <w:r>
+        <w:t>Steering movable panels for the crop has also been studied. A water-budget and crop model was built for lettuce under orientable panels as a first step toward piloting the panels and irrigation together [6]. A model predictive controller for dual-axis panels optimizes the combined value of crop yield and electricity over a season from weather forecasts [7]. A dynamic semitransparent panel has been used to allocate sunlight between solar cells and crops [8], and the light productivity factor has been proposed to rank array designs for particular crops [9]. Feedback from canopy light, temperature, or soil moisture is therefore not new as an idea.</w:t>
+      </w:r>
+    </w:p>
+    <w:p>
+      <w:pPr>
+        <w:pStyle w:val="BodyTextIndent"/>
+      </w:pPr>
+      <w:r>
+        <w:rPr>
+          <w:b/>
+        </w:rPr>
+        <w:t>Prior-art search.</w:t>
+      </w:r>
+      <w:r>
+        <w:t xml:space="preserve"> We searched the scholarly literature and patent records with web search engines in October 2026, using combinations of agrivoltaic, tilt or tracking control, PAR or crop sensor, soil moisture, water stress, model predictive control, and cable or lever drive. We found model-based and forecast-based tilt control [6], [7], and single-drive trackers in which one actuator or a pair of pull cables turns the torque tubes of several rows through lever arms [11], [12]. We did not find a study that measures how close a sensor-driven tilt controller gets to the best possible angle under sensor noise, sensor faults, and an error in the crop light model, or one that tests which sensors that accuracy depends on. Those are the contributions we claim. The search was not a professional patent search, and the wire-driven mechanism uses a known principle.</w:t>
       </w:r>
     </w:p>
     <w:p>
@@ -908,7 +930,7 @@
         <w:t>Sensors.</w:t>
       </w:r>
       <w:r>
-        <w:t xml:space="preserve"> The pyranometer gives the global horizontal irradiance (GHI), which is split into beam and diffuse parts with the correlation of Erbs et al. [9]. A sensor for photosynthetically active radiation (PAR) under the panels measures the light that actually reaches the crop. The model predicts the ratio of PAR to GHI at the angle in use, and the correction applied to the modelled crop light is</w:t>
+        <w:t xml:space="preserve"> The pyranometer gives the global horizontal irradiance (GHI), which is split into beam and diffuse parts with the correlation of Erbs et al. [13]. A sensor for photosynthetically active radiation (PAR) under the panels measures the light that actually reaches the crop. The model predicts the ratio of PAR to GHI at the angle in use, and the correction applied to the modelled crop light is</w:t>
       </w:r>
     </w:p>
     <w:p>
@@ -1005,7 +1027,7 @@
         <w:t>Models.</w:t>
       </w:r>
       <w:r>
-        <w:t xml:space="preserve"> Sun position follows the usual declination and hour-angle equations. Monthly climate comes from the NASA POWER data set [10]; hourly irradiance is the clearness index times the extraterrestrial value. Panel power uses the Huld et al. model [11] with 14 percent system losses, row self-shading, and an incidence-angle modifier. Ground light is found by casting rays in the east–west plane to 40 points per row pitch every hour, with an isotropic sky view factor, and is averaged over four crop zones per pitch. Reference evapotranspiration follows Hargreaves and Samani [12], the daily root-zone water balance follows FAO-56 [13], and yield is</w:t>
+        <w:t xml:space="preserve"> Sun position follows the usual declination and hour-angle equations. Monthly climate comes from the NASA POWER data set [14]; hourly irradiance is the clearness index times the extraterrestrial value. Panel power uses the Huld et al. model [15] with 14 percent system losses, row self-shading, and an incidence-angle modifier. Ground light is found by casting rays in the east–west plane to 40 points per row pitch every hour, with an isotropic sky view factor, and is averaged over four crop zones per pitch. Reference evapotranspiration follows Hargreaves and Samani [16], the daily root-zone water balance follows FAO-56 [17], and yield is</w:t>
       </w:r>
     </w:p>
     <w:p>
@@ -1210,7 +1232,7 @@
         <w:t>y</w:t>
       </w:r>
       <w:r>
-        <w:t xml:space="preserve"> is the yield response factor of Doorenbos and Kassam [14]. The light factor is 1 at or above an optimum light level of the crop, falls linearly to 0.35 at a minimum level, and falls to zero in darkness. Crop parameters are typical literature values rounded for a screening model. The modelled array has rows of panels 2.5 m wide on a 2.5 m pitch, a pivot axis 5.58 m above ground, and a tilt range of 15° to 60°.</w:t>
+        <w:t xml:space="preserve"> is the yield response factor of Doorenbos and Kassam [18]. The light factor is 1 at or above an optimum light level of the crop, falls linearly to 0.35 at a minimum level, and falls to zero in darkness. Crop parameters are typical literature values rounded for a screening model. The modelled array has rows of panels 2.5 m wide on a 2.5 m pitch, a pivot axis 5.58 m above ground, and a tilt range of 15° to 60°.</w:t>
       </w:r>
     </w:p>
     <w:p>
@@ -1224,7 +1246,7 @@
         <w:t>Verification.</w:t>
       </w:r>
       <w:r>
-        <w:t xml:space="preserve"> The panel power model was compared with PVGIS ERA5 data [15] for a horizontal plane at the reference site: the annual energy is 5.0 percent higher and the irradiation 5.2 percent higher, with monthly differences from –1.0 to 10.8 percent. The shadow model was compared with a 3D ray tracer (Blender Cycles, direct light) in 80 cases; the mean absolute difference in lit fraction is 0.010, and 96 percent of cases are within 0.10. The models and the controller exist as a MATLAB engine, a browser digital twin in JavaScript, and a Simulink model of the supervisory rules. The two engines agree to 0.0000 percent on 22 outputs, and the two controllers chose the same mode and angle in 40 of 40 random sensor states. This checks the code, not the physics; the crop and water models are not validated against field data.</w:t>
+        <w:t xml:space="preserve"> The panel power model was compared with PVGIS ERA5 data [19] for a horizontal plane at the reference site: the annual energy is 5.0 percent higher and the irradiation 5.2 percent higher, with monthly differences from –1.0 to 10.8 percent. The shadow model was compared with a 3D ray tracer (Blender Cycles, direct light) in 80 cases; the mean absolute difference in lit fraction is 0.010, and 96 percent of cases are within 0.10. The models and the controller exist as a MATLAB engine, a browser digital twin in JavaScript, and a Simulink model of the supervisory rules. The two engines agree to 0.0000 percent on 22 outputs, and the two controllers chose the same mode and angle in 40 of 40 random sensor states. This checks the code, not the physics; the crop and water models are not validated against field data.</w:t>
       </w:r>
     </w:p>
     <w:p>
@@ -3769,7 +3791,7 @@
         <w:pStyle w:val="BodyTextIndent"/>
       </w:pPr>
       <w:r>
-        <w:t xml:space="preserve">The controller needs an actuator that turns many rows together at low cost. In our design, rows of panels on torque tubes hang from stainless-steel carrier ropes (16 mm) between columns 5 m apart, with the lowest panel edge 4.5 m above the crop at 60° (Fig. 3). One drive wire is clamped to the tip of a lever arm of length </w:t>
+        <w:t xml:space="preserve">The controller needs an actuator that turns many rows together at low cost. In our design, rows of panels on torque tubes hang from stainless-steel carrier ropes (16 mm) between columns 5 m apart, with the lowest panel edge 4.5 m above the crop at 60° (Fig. 3). As in earlier single-drive trackers [11], [12], one drive wire is clamped to the tip of a lever arm of length </w:t>
       </w:r>
       <w:r>
         <w:rPr>
@@ -3856,7 +3878,7 @@
         <w:pStyle w:val="BodyTextIndent"/>
       </w:pPr>
       <w:r>
-        <w:t>The wire moves 408 mm to reach 60° and 606 mm to reach the 90° storm position, and a lever of at least 0.31 m remains at 90°, where a plain arm without the offset has none (Fig. 4). Both ends of the wire are fastened to a 120 mm drum, which turns 1.61 times over the full range, so the wire pulls in both directions. A screening check of the structure with the wind loads of IS 875 (Part 3) [16] at 140 km/h, with an assumed basic wind speed of 39 m/s, gave load-to-capacity ratios of 0.37 for the carrier rope, 0.32 for the stays, and 0.76 for the torque tube; a layout with 12.5 m spans failed the same check. With a 6 mm drive wire and a 10 kN worm-gear winch, the drive works at 0.41 of capacity at a wind of 54 km/h, the speed at which the controller stows the panels.</w:t>
+        <w:t>The wire moves 408 mm to reach 60° and 606 mm to reach the 90° storm position, and a lever of at least 0.31 m remains at 90°, where a plain arm without the offset has none (Fig. 4). Both ends of the wire are fastened to a 120 mm drum, which turns 1.61 times over the full range, so the wire pulls in both directions. A screening check of the structure with the wind loads of IS 875 (Part 3) [20] at 140 km/h, with an assumed basic wind speed of 39 m/s, gave load-to-capacity ratios of 0.37 for the carrier rope, 0.32 for the stays, and 0.76 for the torque tube; a layout with 12.5 m spans failed the same check. With a 6 mm drive wire and a 10 kN worm-gear winch, the drive works at 0.41 of capacity at a wind of 54 km/h, the speed at which the controller stows the panels.</w:t>
       </w:r>
     </w:p>
     <w:p>
@@ -4141,16 +4163,16 @@
         <w:spacing w:before="0" w:after="100"/>
       </w:pPr>
       <w:r>
-        <w:t xml:space="preserve">[6] A. Yano and Z. Li, “Application of a dynamic semitransparent agrivoltaic panel for controlling sunlight allocation to solar cells and crops,” </w:t>
-      </w:r>
-      <w:r>
-        <w:rPr>
-          <w:i/>
-        </w:rPr>
-        <w:t>Adv. Sustain. Syst.</w:t>
-      </w:r>
-      <w:r>
-        <w:t>, 2025, doi: 10.1002/adsu.202500603.</w:t>
+        <w:t xml:space="preserve">[6] Y. Elamri et al., “Water budget and crop modelling for agrivoltaic systems: Application to irrigated lettuces,” </w:t>
+      </w:r>
+      <w:r>
+        <w:rPr>
+          <w:i/>
+        </w:rPr>
+        <w:t>Agric. Water Manag.</w:t>
+      </w:r>
+      <w:r>
+        <w:t>, vol. 208, pp. 440–453, 2018, doi: 10.1016/j.agwat.2018.07.001.</w:t>
       </w:r>
     </w:p>
     <w:p>
@@ -4159,16 +4181,16 @@
         <w:spacing w:before="0" w:after="100"/>
       </w:pPr>
       <w:r>
-        <w:t xml:space="preserve">[7] M. H. Riaz et al., “Crop-specific optimization of bifacial PV arrays for agrivoltaic food-energy production: The light-productivity-factor approach,” </w:t>
-      </w:r>
-      <w:r>
-        <w:rPr>
-          <w:i/>
-        </w:rPr>
-        <w:t>IEEE J. Photovolt.</w:t>
-      </w:r>
-      <w:r>
-        <w:t>, vol. 12, no. 2, pp. 572–580, 2022, doi: 10.1109/JPHOTOV.2021.3136158.</w:t>
+        <w:t xml:space="preserve">[7] A. Stuhlmacher et al., “A model predictive control approach to dual-axis agrivoltaic panel tracking,” </w:t>
+      </w:r>
+      <w:r>
+        <w:rPr>
+          <w:i/>
+        </w:rPr>
+        <w:t>Renew. Energy</w:t>
+      </w:r>
+      <w:r>
+        <w:t>, vol. 274, Art. no. 126155, 2026, doi: 10.1016/j.renene.2026.126155.</w:t>
       </w:r>
     </w:p>
     <w:p>
@@ -4177,16 +4199,16 @@
         <w:spacing w:before="0" w:after="100"/>
       </w:pPr>
       <w:r>
-        <w:t xml:space="preserve">[8] </w:t>
-      </w:r>
-      <w:r>
-        <w:rPr>
-          <w:i/>
-        </w:rPr>
-        <w:t>Agri-Photovoltaic Systems – Requirements for Primary Agricultural Use</w:t>
-      </w:r>
-      <w:r>
-        <w:t>, DIN SPEC 91434:2021-05, DIN, Berlin, Germany, 2021.</w:t>
+        <w:t xml:space="preserve">[8] A. Yano and Z. Li, “Application of a dynamic semitransparent agrivoltaic panel for controlling sunlight allocation to solar cells and crops,” </w:t>
+      </w:r>
+      <w:r>
+        <w:rPr>
+          <w:i/>
+        </w:rPr>
+        <w:t>Adv. Sustain. Syst.</w:t>
+      </w:r>
+      <w:r>
+        <w:t>, 2025, doi: 10.1002/adsu.202500603.</w:t>
       </w:r>
     </w:p>
     <w:p>
@@ -4195,16 +4217,16 @@
         <w:spacing w:before="0" w:after="100"/>
       </w:pPr>
       <w:r>
-        <w:t xml:space="preserve">[9] D. G. Erbs et al., “Estimation of the diffuse radiation fraction for hourly, daily and monthly-average global radiation,” </w:t>
-      </w:r>
-      <w:r>
-        <w:rPr>
-          <w:i/>
-        </w:rPr>
-        <w:t>Sol. Energy</w:t>
-      </w:r>
-      <w:r>
-        <w:t>, vol. 28, no. 4, pp. 293–302, 1982.</w:t>
+        <w:t xml:space="preserve">[9] M. H. Riaz et al., “Crop-specific optimization of bifacial PV arrays for agrivoltaic food-energy production: The light-productivity-factor approach,” </w:t>
+      </w:r>
+      <w:r>
+        <w:rPr>
+          <w:i/>
+        </w:rPr>
+        <w:t>IEEE J. Photovolt.</w:t>
+      </w:r>
+      <w:r>
+        <w:t>, vol. 12, no. 2, pp. 572–580, 2022, doi: 10.1109/JPHOTOV.2021.3136158.</w:t>
       </w:r>
     </w:p>
     <w:p>
@@ -4213,7 +4235,16 @@
         <w:spacing w:before="0" w:after="100"/>
       </w:pPr>
       <w:r>
-        <w:t>[10] NASA, “Prediction of Worldwide Energy Resources (POWER) project.” [Online]. Available: power.larc.nasa.gov</w:t>
+        <w:t xml:space="preserve">[10] </w:t>
+      </w:r>
+      <w:r>
+        <w:rPr>
+          <w:i/>
+        </w:rPr>
+        <w:t>Agri-Photovoltaic Systems – Requirements for Primary Agricultural Use</w:t>
+      </w:r>
+      <w:r>
+        <w:t>, DIN SPEC 91434:2021-05, DIN, Berlin, Germany, 2021.</w:t>
       </w:r>
     </w:p>
     <w:p>
@@ -4222,16 +4253,7 @@
         <w:spacing w:before="0" w:after="100"/>
       </w:pPr>
       <w:r>
-        <w:t xml:space="preserve">[11] T. Huld et al., “Mapping the performance of PV modules, effects of module type and data averaging,” </w:t>
-      </w:r>
-      <w:r>
-        <w:rPr>
-          <w:i/>
-        </w:rPr>
-        <w:t>Sol. Energy</w:t>
-      </w:r>
-      <w:r>
-        <w:t>, vol. 84, no. 2, pp. 324–338, 2010.</w:t>
+        <w:t>[11] J. Shingleton, “Solar collector and tracker arrangement,” U.S. Patent 6 058 930, May 9, 2000.</w:t>
       </w:r>
     </w:p>
     <w:p>
@@ -4240,16 +4262,7 @@
         <w:spacing w:before="0" w:after="100"/>
       </w:pPr>
       <w:r>
-        <w:t xml:space="preserve">[12] G. H. Hargreaves and Z. A. Samani, “Reference crop evapotranspiration from temperature,” </w:t>
-      </w:r>
-      <w:r>
-        <w:rPr>
-          <w:i/>
-        </w:rPr>
-        <w:t>Appl. Eng. Agric.</w:t>
-      </w:r>
-      <w:r>
-        <w:t>, vol. 1, no. 2, pp. 96–99, 1985.</w:t>
+        <w:t>[12] R. B. Dally, “Drive system for single axis solar tracking,” U.S. Patent 12 355 392 B2, Jul. 8, 2025.</w:t>
       </w:r>
     </w:p>
     <w:p>
@@ -4258,16 +4271,16 @@
         <w:spacing w:before="0" w:after="100"/>
       </w:pPr>
       <w:r>
-        <w:t xml:space="preserve">[13] R. G. Allen et al., </w:t>
-      </w:r>
-      <w:r>
-        <w:rPr>
-          <w:i/>
-        </w:rPr>
-        <w:t>Crop Evapotranspiration: Guidelines for Computing Crop Water Requirements</w:t>
-      </w:r>
-      <w:r>
-        <w:t>, FAO Irrigation and Drainage Paper 56. Rome, Italy: FAO, 1998.</w:t>
+        <w:t xml:space="preserve">[13] D. G. Erbs et al., “Estimation of the diffuse radiation fraction for hourly, daily and monthly-average global radiation,” </w:t>
+      </w:r>
+      <w:r>
+        <w:rPr>
+          <w:i/>
+        </w:rPr>
+        <w:t>Sol. Energy</w:t>
+      </w:r>
+      <w:r>
+        <w:t>, vol. 28, no. 4, pp. 293–302, 1982.</w:t>
       </w:r>
     </w:p>
     <w:p>
@@ -4276,16 +4289,7 @@
         <w:spacing w:before="0" w:after="100"/>
       </w:pPr>
       <w:r>
-        <w:t xml:space="preserve">[14] J. Doorenbos and A. H. Kassam, </w:t>
-      </w:r>
-      <w:r>
-        <w:rPr>
-          <w:i/>
-        </w:rPr>
-        <w:t>Yield Response to Water</w:t>
-      </w:r>
-      <w:r>
-        <w:t>, FAO Irrigation and Drainage Paper 33. Rome, Italy: FAO, 1979.</w:t>
+        <w:t>[14] NASA, “Prediction of Worldwide Energy Resources (POWER) project.” [Online]. Available: power.larc.nasa.gov</w:t>
       </w:r>
     </w:p>
     <w:p>
@@ -4294,7 +4298,16 @@
         <w:spacing w:before="0" w:after="100"/>
       </w:pPr>
       <w:r>
-        <w:t>[15] European Commission Joint Research Centre, “Photovoltaic Geographical Information System (PVGIS).” [Online]. Available: re.jrc.ec.europa.eu/pvg_tools</w:t>
+        <w:t xml:space="preserve">[15] T. Huld et al., “Mapping the performance of PV modules, effects of module type and data averaging,” </w:t>
+      </w:r>
+      <w:r>
+        <w:rPr>
+          <w:i/>
+        </w:rPr>
+        <w:t>Sol. Energy</w:t>
+      </w:r>
+      <w:r>
+        <w:t>, vol. 84, no. 2, pp. 324–338, 2010.</w:t>
       </w:r>
     </w:p>
     <w:p>
@@ -4303,7 +4316,70 @@
         <w:spacing w:before="0" w:after="100"/>
       </w:pPr>
       <w:r>
-        <w:t xml:space="preserve">[16] </w:t>
+        <w:t xml:space="preserve">[16] G. H. Hargreaves and Z. A. Samani, “Reference crop evapotranspiration from temperature,” </w:t>
+      </w:r>
+      <w:r>
+        <w:rPr>
+          <w:i/>
+        </w:rPr>
+        <w:t>Appl. Eng. Agric.</w:t>
+      </w:r>
+      <w:r>
+        <w:t>, vol. 1, no. 2, pp. 96–99, 1985.</w:t>
+      </w:r>
+    </w:p>
+    <w:p>
+      <w:pPr>
+        <w:pStyle w:val="Heading3"/>
+        <w:spacing w:before="0" w:after="100"/>
+      </w:pPr>
+      <w:r>
+        <w:t xml:space="preserve">[17] R. G. Allen et al., </w:t>
+      </w:r>
+      <w:r>
+        <w:rPr>
+          <w:i/>
+        </w:rPr>
+        <w:t>Crop Evapotranspiration: Guidelines for Computing Crop Water Requirements</w:t>
+      </w:r>
+      <w:r>
+        <w:t>, FAO Irrigation and Drainage Paper 56. Rome, Italy: FAO, 1998.</w:t>
+      </w:r>
+    </w:p>
+    <w:p>
+      <w:pPr>
+        <w:pStyle w:val="Heading3"/>
+        <w:spacing w:before="0" w:after="100"/>
+      </w:pPr>
+      <w:r>
+        <w:t xml:space="preserve">[18] J. Doorenbos and A. H. Kassam, </w:t>
+      </w:r>
+      <w:r>
+        <w:rPr>
+          <w:i/>
+        </w:rPr>
+        <w:t>Yield Response to Water</w:t>
+      </w:r>
+      <w:r>
+        <w:t>, FAO Irrigation and Drainage Paper 33. Rome, Italy: FAO, 1979.</w:t>
+      </w:r>
+    </w:p>
+    <w:p>
+      <w:pPr>
+        <w:pStyle w:val="Heading3"/>
+        <w:spacing w:before="0" w:after="100"/>
+      </w:pPr>
+      <w:r>
+        <w:t>[19] European Commission Joint Research Centre, “Photovoltaic Geographical Information System (PVGIS).” [Online]. Available: re.jrc.ec.europa.eu/pvg_tools</w:t>
+      </w:r>
+    </w:p>
+    <w:p>
+      <w:pPr>
+        <w:pStyle w:val="Heading3"/>
+        <w:spacing w:before="0" w:after="100"/>
+      </w:pPr>
+      <w:r>
+        <w:t xml:space="preserve">[20] </w:t>
       </w:r>
       <w:r>
         <w:rPr>

</xml_diff>